<commit_message>
TuntiTutka: ratkaise tehtävänannon ristiriidat
SQLite on sovittu toteutustapa, ja työviikon 2 vertailu perustelee sen.
Projektin voi poistaa vain, jos sillä ei ole kirjauksia (409 ja selkeä syy);
uusi testitapaus T14. Linkitetty näyttömatriisi on nayttomatriisi.md.
Julkiseen repoon vain roolit (lainaukset roolilla merkittyinä); ohjaaja on
asiakkaan sijainen. Koontikortti: kaaviokirjasto on oma valinta, ei Chart.js.
Lataukset ja odotukset rakennettu uudelleen.

Co-Authored-By: Claude Opus 5.5 <noreply@anthropic.com>
</commit_message>
<xml_diff>
--- a/tuntitutka/downloads/nayton-dokumentointipohjat.docx
+++ b/tuntitutka/downloads/nayton-dokumentointipohjat.docx
@@ -763,7 +763,7 @@
           <w:sz w:val="21"/>
           <w:szCs w:val="21"/>
         </w:rPr>
-        <w:t xml:space="preserve">Keskustelukumppani, rooli ja pvm:</w:t>
+        <w:t xml:space="preserve">Keskustelukumppanin rooli (ei nimeä) ja pvm:</w:t>
       </w:r>
     </w:p>
     <w:p>
@@ -887,7 +887,7 @@
                 <w:sz w:val="19"/>
                 <w:szCs w:val="19"/>
               </w:rPr>
-              <w:t xml:space="preserve">Osallistujat ja roolit</w:t>
+              <w:t xml:space="preserve">Osallistujien roolit (ei nimiä)</w:t>
             </w:r>
           </w:p>
         </w:tc>
@@ -937,7 +937,7 @@
                 <w:sz w:val="19"/>
                 <w:szCs w:val="19"/>
               </w:rPr>
-              <w:t xml:space="preserve">Testaajan alkuperäinen havainto (hänen sanoillaan)</w:t>
+              <w:t xml:space="preserve">Testaajan havainto hänen sanoillaan (merkitse rooli, ei nimeä)</w:t>
             </w:r>
           </w:p>
         </w:tc>
@@ -1127,7 +1127,7 @@
           <w:sz w:val="21"/>
           <w:szCs w:val="21"/>
         </w:rPr>
-        <w:t xml:space="preserve">Erota aina testaajan sanat omasta tulkinnastasi.</w:t>
+        <w:t xml:space="preserve">Erota aina testaajan sanat omasta tulkinnastasi. Julkiseen repositoryyn kirjataan henkilöistä vain rooli; nimet ohjaajalle Teamsissa tarvittaessa.</w:t>
       </w:r>
     </w:p>
     <w:p>
@@ -2971,6 +2971,141 @@
                 <w:szCs w:val="19"/>
               </w:rPr>
               <w:t xml:space="preserve">T13</w:t>
+            </w:r>
+          </w:p>
+        </w:tc>
+        <w:tc>
+          <w:tcPr>
+            <w:tcW w:type="dxa" w:w="2120"/>
+            <w:tcMar>
+              <w:top w:type="dxa" w:w="60"/>
+              <w:left w:type="dxa" w:w="100"/>
+              <w:bottom w:type="dxa" w:w="60"/>
+              <w:right w:type="dxa" w:w="100"/>
+            </w:tcMar>
+          </w:tcPr>
+          <w:p>
+            <w:pPr>
+              <w:spacing w:after="0"/>
+            </w:pPr>
+            <w:r>
+              <w:rPr>
+                <w:sz w:val="19"/>
+                <w:szCs w:val="19"/>
+              </w:rPr>
+            </w:r>
+          </w:p>
+        </w:tc>
+        <w:tc>
+          <w:tcPr>
+            <w:tcW w:type="dxa" w:w="2410"/>
+            <w:tcMar>
+              <w:top w:type="dxa" w:w="60"/>
+              <w:left w:type="dxa" w:w="100"/>
+              <w:bottom w:type="dxa" w:w="60"/>
+              <w:right w:type="dxa" w:w="100"/>
+            </w:tcMar>
+          </w:tcPr>
+          <w:p>
+            <w:pPr>
+              <w:spacing w:after="0"/>
+            </w:pPr>
+            <w:r>
+              <w:rPr>
+                <w:sz w:val="19"/>
+                <w:szCs w:val="19"/>
+              </w:rPr>
+            </w:r>
+          </w:p>
+        </w:tc>
+        <w:tc>
+          <w:tcPr>
+            <w:tcW w:type="dxa" w:w="2120"/>
+            <w:tcMar>
+              <w:top w:type="dxa" w:w="60"/>
+              <w:left w:type="dxa" w:w="100"/>
+              <w:bottom w:type="dxa" w:w="60"/>
+              <w:right w:type="dxa" w:w="100"/>
+            </w:tcMar>
+          </w:tcPr>
+          <w:p>
+            <w:pPr>
+              <w:spacing w:after="0"/>
+            </w:pPr>
+            <w:r>
+              <w:rPr>
+                <w:sz w:val="19"/>
+                <w:szCs w:val="19"/>
+              </w:rPr>
+            </w:r>
+          </w:p>
+        </w:tc>
+        <w:tc>
+          <w:tcPr>
+            <w:tcW w:type="dxa" w:w="1638"/>
+            <w:tcMar>
+              <w:top w:type="dxa" w:w="60"/>
+              <w:left w:type="dxa" w:w="100"/>
+              <w:bottom w:type="dxa" w:w="60"/>
+              <w:right w:type="dxa" w:w="100"/>
+            </w:tcMar>
+          </w:tcPr>
+          <w:p>
+            <w:pPr>
+              <w:spacing w:after="0"/>
+            </w:pPr>
+            <w:r>
+              <w:rPr>
+                <w:sz w:val="19"/>
+                <w:szCs w:val="19"/>
+              </w:rPr>
+            </w:r>
+          </w:p>
+        </w:tc>
+        <w:tc>
+          <w:tcPr>
+            <w:tcW w:type="dxa" w:w="675"/>
+            <w:tcMar>
+              <w:top w:type="dxa" w:w="60"/>
+              <w:left w:type="dxa" w:w="100"/>
+              <w:bottom w:type="dxa" w:w="60"/>
+              <w:right w:type="dxa" w:w="100"/>
+            </w:tcMar>
+          </w:tcPr>
+          <w:p>
+            <w:pPr>
+              <w:spacing w:after="0"/>
+            </w:pPr>
+            <w:r>
+              <w:rPr>
+                <w:sz w:val="19"/>
+                <w:szCs w:val="19"/>
+              </w:rPr>
+            </w:r>
+          </w:p>
+        </w:tc>
+      </w:tr>
+      <w:tr>
+        <w:tc>
+          <w:tcPr>
+            <w:tcW w:type="dxa" w:w="675"/>
+            <w:tcMar>
+              <w:top w:type="dxa" w:w="60"/>
+              <w:left w:type="dxa" w:w="100"/>
+              <w:bottom w:type="dxa" w:w="60"/>
+              <w:right w:type="dxa" w:w="100"/>
+            </w:tcMar>
+          </w:tcPr>
+          <w:p>
+            <w:pPr>
+              <w:spacing w:after="0"/>
+            </w:pPr>
+            <w:r>
+              <w:rPr>
+                <w:sz w:val="19"/>
+                <w:szCs w:val="19"/>
+              </w:rPr>
+              <w:t xml:space="preserve">T14</w:t>
             </w:r>
           </w:p>
         </w:tc>

</xml_diff>